<commit_message>
Autofill new requests, team view, temperature 0, demo sets and leadership docs
- Requester form: prefill fields from uploaded documents (prefill.py, prefill.js)
- Buyer team view (team.py, team_routes, team.html)
- LLM calls now run at temperature 0
- Regenerated demo sets; removed old generated RFQ rounds and repository files
- Docs: leadership Q&A, business guide, demo script, technical guide, jury deck

Co-Authored-By: Claude Opus 5.5 <noreply@anthropic.com>
</commit_message>
<xml_diff>
--- a/demo_documents/portal_upload/CASE-31_Network_printers_branches/04_Quotation_Printwell.docx
+++ b/demo_documents/portal_upload/CASE-31_Network_printers_branches/04_Quotation_Printwell.docx
@@ -165,7 +165,7 @@
           </w:tcPr>
           <w:p>
             <w:r>
-              <w:t>HP 151A Black Toner W1510A</w:t>
+              <w:t>APC Back-UPS BX1100C-IN 1100VA</w:t>
             </w:r>
           </w:p>
         </w:tc>
@@ -175,7 +175,7 @@
           </w:tcPr>
           <w:p>
             <w:r>
-              <w:t>12</w:t>
+              <w:t>6</w:t>
             </w:r>
           </w:p>
         </w:tc>
@@ -185,7 +185,7 @@
           </w:tcPr>
           <w:p>
             <w:r>
-              <w:t>6850</w:t>
+              <w:t>6200</w:t>
             </w:r>
           </w:p>
         </w:tc>
@@ -205,7 +205,7 @@
           </w:tcPr>
           <w:p>
             <w:r>
-              <w:t>82200</w:t>
+              <w:t>37200</w:t>
             </w:r>
           </w:p>
         </w:tc>
@@ -266,7 +266,7 @@
     <w:p/>
     <w:p>
       <w:r>
-        <w:t>Net total (excluding VAT): INR 318600</w:t>
+        <w:t>Net total (excluding VAT): INR 273600</w:t>
       </w:r>
     </w:p>
     <w:p/>
@@ -295,12 +295,12 @@
         <w:br/>
         <w:t>HP LaserJet Pro MFP 4104dw: Rs 37,900 per unit x 6</w:t>
         <w:br/>
-        <w:t>HP 151A Black Toner W1510A: Rs 6,850 per unit x 12</w:t>
+        <w:t>APC Back-UPS BX1100C-IN 1100VA: Rs 6,200 per unit x 6</w:t>
         <w:br/>
         <w:t>Installation and network configuration (per site): Rs 1,500 per unit x 6</w:t>
         <w:br/>
         <w:br/>
-        <w:t>Total Rs 3,18,600 exclusive of 18% GST.</w:t>
+        <w:t>Total Rs 2,73,600 exclusive of 18% GST.</w:t>
         <w:br/>
         <w:t>Delivery 10 working days from PO to Gurugram. Validity 30 days. Payment Net 30.</w:t>
         <w:br/>

</xml_diff>